<commit_message>
chore: harden deployment and QA process
</commit_message>
<xml_diff>
--- a/qa/TESTING_CHECKLIST_CLIENT.docx
+++ b/qa/TESTING_CHECKLIST_CLIENT.docx
@@ -9,37 +9,132 @@
     </w:p>
     <w:p>
       <w:r>
-        <w:t>Purpose: first full software QA cycle after dev testing.</w:t>
+        <w:t># Hawkaii HRMS QA Checklist</w:t>
       </w:r>
     </w:p>
     <w:p>
       <w:r>
-        <w:t>Execution order: P0 UAT Gate, then P1 Core Regression, then P2 Deep Regression.</w:t>
+        <w:t/>
       </w:r>
     </w:p>
     <w:p>
       <w:r>
-        <w:t>P0 release blockers include auth/session failure, cross-org data leak, self-approval, broken expense payment flow, document storage loss, and production mock fallback.</w:t>
+        <w:t>This is the client-friendly QA summary for the hosted deployment and full product test cycle.</w:t>
       </w:r>
     </w:p>
     <w:p>
       <w:r>
-        <w:t>Use the workbook to fill Status, Actual Result, Defect ID, Evidence, and Notes.</w:t>
+        <w:t/>
       </w:r>
     </w:p>
     <w:p>
       <w:r>
-        <w:t>QA/UAT/prod document persistence requires real Cloudinary. Local mock storage is not enough for release signoff.</w:t>
+        <w:t>## Environments</w:t>
       </w:r>
     </w:p>
     <w:p>
       <w:r>
-        <w:t>Desktop is primary, but mobile smoke is required for employee login, dashboard, attendance, leave, expense, and helpdesk.</w:t>
+        <w:t/>
       </w:r>
     </w:p>
     <w:p>
       <w:r>
-        <w:t>Sprint plan: Sprint 1 P0 gate, Sprint 2 HR/core regression, Sprint 3 business operations and deep regression.</w:t>
+        <w:t>- Production: `https://hawkaii.in`</w:t>
+      </w:r>
+    </w:p>
+    <w:p>
+      <w:r>
+        <w:t>- QA: `https://qa.hawkaii.in`</w:t>
+      </w:r>
+    </w:p>
+    <w:p>
+      <w:r>
+        <w:t>- Hosted dev: `https://dev.hawkaii.in`</w:t>
+      </w:r>
+    </w:p>
+    <w:p>
+      <w:r>
+        <w:t/>
+      </w:r>
+    </w:p>
+    <w:p>
+      <w:r>
+        <w:t>## Tester Execution Order</w:t>
+      </w:r>
+    </w:p>
+    <w:p>
+      <w:r>
+        <w:t/>
+      </w:r>
+    </w:p>
+    <w:p>
+      <w:r>
+        <w:t>1. Release Gate P0.</w:t>
+      </w:r>
+    </w:p>
+    <w:p>
+      <w:r>
+        <w:t>2. Deployment Smoke.</w:t>
+      </w:r>
+    </w:p>
+    <w:p>
+      <w:r>
+        <w:t>3. Sprint Regression.</w:t>
+      </w:r>
+    </w:p>
+    <w:p>
+      <w:r>
+        <w:t>4. Full Regression.</w:t>
+      </w:r>
+    </w:p>
+    <w:p>
+      <w:r>
+        <w:t>5. Signoff.</w:t>
+      </w:r>
+    </w:p>
+    <w:p>
+      <w:r>
+        <w:t/>
+      </w:r>
+    </w:p>
+    <w:p>
+      <w:r>
+        <w:t>## Release Blockers</w:t>
+      </w:r>
+    </w:p>
+    <w:p>
+      <w:r>
+        <w:t/>
+      </w:r>
+    </w:p>
+    <w:p>
+      <w:r>
+        <w:t>- Login/session failure.</w:t>
+      </w:r>
+    </w:p>
+    <w:p>
+      <w:r>
+        <w:t>- Cross-environment or cross-company data leak.</w:t>
+      </w:r>
+    </w:p>
+    <w:p>
+      <w:r>
+        <w:t>- Production or QA using mock storage/API fallback.</w:t>
+      </w:r>
+    </w:p>
+    <w:p>
+      <w:r>
+        <w:t>- Broken expense approval/payment/settlement flow.</w:t>
+      </w:r>
+    </w:p>
+    <w:p>
+      <w:r>
+        <w:t>- Document upload/open/delete failure in hosted QA.</w:t>
+      </w:r>
+    </w:p>
+    <w:p>
+      <w:r>
+        <w:t>- Failed production deployment smoke without approved rollback.</w:t>
       </w:r>
     </w:p>
     <w:sectPr/>

</xml_diff>

<commit_message>
Refactor QA validation scripts and update documentation
- Removed `validate_qa_artifacts.py` script as it is no longer needed.
- Enhanced `validate_testing_workbook.py` with new validation rules and improved error handling.
- Introduced new timeline execution and daily submission plans in `QA_TIMELINE_EXECUTION_PLAN.md` and `QA_DAILY_SUBMISSION_PLAN.md`.
- Added `QA_TIMELINE_VALIDATION_LOG.md` to log validation results and changes.
- Updated validation logic to include checks for execution days, submission statuses, and blocker escalation.
- Improved handling of workbook reading with fallbacks for XML parsing.
- Added new forbidden terms and client secret checks to enhance security.
- Updated logging format to provide clearer output for validation results.
</commit_message>
<xml_diff>
--- a/qa/TESTING_CHECKLIST_CLIENT.docx
+++ b/qa/TESTING_CHECKLIST_CLIENT.docx
@@ -9,122 +9,117 @@
     </w:p>
     <w:p>
       <w:r>
-        <w:t># Hawkaii HRMS QA Checklist</w:t>
+        <w:t>This is the client-friendly QA summary for the first full hosted QA cycle.</w:t>
       </w:r>
     </w:p>
     <w:p>
       <w:r>
-        <w:t/>
+        <w:t>Timeline</w:t>
       </w:r>
     </w:p>
     <w:p>
       <w:r>
-        <w:t>This is the client-friendly QA summary for the hosted deployment and full product test cycle.</w:t>
+        <w:t>- QA start: `2026-06-10 09:00 IST`</w:t>
       </w:r>
     </w:p>
     <w:p>
       <w:r>
-        <w:t/>
+        <w:t>- Planned completion: `2026-06-16`</w:t>
       </w:r>
     </w:p>
     <w:p>
       <w:r>
-        <w:t>## Environments</w:t>
+        <w:t>- Final QA submission: `2026-06-16 18:00 IST`</w:t>
       </w:r>
     </w:p>
     <w:p>
       <w:r>
-        <w:t/>
+        <w:t>- Daily evidence/status submission: `20:00 IST`</w:t>
       </w:r>
     </w:p>
     <w:p>
       <w:r>
-        <w:t>- Production: `https://hawkaii.in`</w:t>
+        <w:t>Hosted QA Environment</w:t>
       </w:r>
     </w:p>
     <w:p>
       <w:r>
-        <w:t>- QA: `https://qa.hawkaii.in`</w:t>
+        <w:t>- Frontend: `https://hawkaii-hrms.vercel.app`</w:t>
       </w:r>
     </w:p>
     <w:p>
       <w:r>
-        <w:t>- Hosted dev: `https://dev.hawkaii.in`</w:t>
+        <w:t>- API: `https://hawkaii-hrms-dev-gyvr.onrender.com`</w:t>
       </w:r>
     </w:p>
     <w:p>
       <w:r>
-        <w:t/>
+        <w:t>The future production, QA, and hosted-dev Hawkaii domains are tracked as readiness items until those isolated services are live.</w:t>
       </w:r>
     </w:p>
     <w:p>
       <w:r>
-        <w:t>## Tester Execution Order</w:t>
+        <w:t>Execution Order</w:t>
       </w:r>
     </w:p>
     <w:p>
       <w:r>
-        <w:t/>
+        <w:t>1. P0 release gate and environment readiness.</w:t>
       </w:r>
     </w:p>
     <w:p>
       <w:r>
-        <w:t>1. Release Gate P0.</w:t>
+        <w:t>2. HR core workflows.</w:t>
       </w:r>
     </w:p>
     <w:p>
       <w:r>
-        <w:t>2. Deployment Smoke.</w:t>
+        <w:t>3. Expense, documents, and media.</w:t>
       </w:r>
     </w:p>
     <w:p>
       <w:r>
-        <w:t>3. Sprint Regression.</w:t>
+        <w:t>4. Projects, assets, helpdesk, and notifications.</w:t>
       </w:r>
     </w:p>
     <w:p>
       <w:r>
-        <w:t>4. Full Regression.</w:t>
+        <w:t>5. Reports, admin policies, and business rules.</w:t>
       </w:r>
     </w:p>
     <w:p>
       <w:r>
-        <w:t>5. Signoff.</w:t>
+        <w:t>6. Full regression, cross-browser checks, and deployment readiness.</w:t>
       </w:r>
     </w:p>
     <w:p>
       <w:r>
-        <w:t/>
+        <w:t>7. Defect retest and final QA submission.</w:t>
       </w:r>
     </w:p>
     <w:p>
       <w:r>
-        <w:t>## Release Blockers</w:t>
+        <w:t>Release Blockers</w:t>
       </w:r>
     </w:p>
     <w:p>
       <w:r>
-        <w:t/>
+        <w:t>- Login, logout, or session failure.</w:t>
       </w:r>
     </w:p>
     <w:p>
       <w:r>
-        <w:t>- Login/session failure.</w:t>
+        <w:t>- Cross-company or unauthorized data exposure.</w:t>
       </w:r>
     </w:p>
     <w:p>
       <w:r>
-        <w:t>- Cross-environment or cross-company data leak.</w:t>
+        <w:t>- Production or hosted QA using mock API/storage fallback for signoff-critical flows.</w:t>
       </w:r>
     </w:p>
     <w:p>
       <w:r>
-        <w:t>- Production or QA using mock storage/API fallback.</w:t>
-      </w:r>
-    </w:p>
-    <w:p>
-      <w:r>
-        <w:t>- Broken expense approval/payment/settlement flow.</w:t>
+        <w:t>- Broken expense approval, payment, or settlement flow.</w:t>
       </w:r>
     </w:p>
     <w:p>
@@ -134,7 +129,12 @@
     </w:p>
     <w:p>
       <w:r>
-        <w:t>- Failed production deployment smoke without approved rollback.</w:t>
+        <w:t>- Any failed P0 without explicit waiver.</w:t>
+      </w:r>
+    </w:p>
+    <w:p>
+      <w:r>
+        <w:t>Production data-changing tests are not part of this cycle unless a safe test tenant and reset process are documented.</w:t>
       </w:r>
     </w:p>
     <w:sectPr/>

</xml_diff>